<commit_message>
Drop "Windows端" prefix from doc filenames
Rename docs/Windows端软件说明.{md,docx} → 软件说明.{md,docx} and
docs/Windows端使用说明书_V26.5.34.{md,docx} → 使用说明书_V26.5.34.{md,docx}
(git mv, history preserved). Update references in windows_app.spec,
README, 软件开发文档; note old name in the changelog. Regenerate
软件开发文档.docx.

Co-Authored-By: Claude Opus 4.8 <noreply@anthropic.com>
</commit_message>
<xml_diff>
--- a/docs/软件开发文档.docx
+++ b/docs/软件开发文档.docx
@@ -64,7 +64,7 @@
           <w:rStyle w:val="VerbatimChar"/>
           <w:rFonts w:hint="eastAsia"/>
         </w:rPr>
-        <w:t xml:space="preserve">Windows端软件说明.md</w:t>
+        <w:t xml:space="preserve">软件说明.md</w:t>
       </w:r>
       <w:r>
         <w:t xml:space="preserve"> </w:t>
@@ -83,7 +83,7 @@
           <w:rStyle w:val="VerbatimChar"/>
           <w:rFonts w:hint="eastAsia"/>
         </w:rPr>
-        <w:t xml:space="preserve">Windows端使用说明书_V26.5.34.md</w:t>
+        <w:t xml:space="preserve">使用说明书_V26.5.34.md</w:t>
       </w:r>
       <w:r>
         <w:rPr>

</xml_diff>